<commit_message>
Actualiza documentos de Fase 1 y agrega fichas de avance y presentación
Co-Authored-By: Claude Opus 5.5 (1M context) <noreply@anthropic.com>
Claude-Session: https://claude.ai/code/session_01BzmHbWCU2zpnyu7dMxJoUo
</commit_message>
<xml_diff>
--- a/Fase 1/Evidencias Grupales/1.4_APT122_FormativaFase1.docx
+++ b/Fase 1/Evidencias Grupales/1.4_APT122_FormativaFase1.docx
@@ -6578,88 +6578,6 @@
           <w:szCs w:val="22"/>
         </w:rPr>
       </w:pPr>
-    </w:p>
-    <w:p>
-      <w:r>
-        <w:br w:type="page"/>
-      </w:r>
-    </w:p>
-    <w:p>
-      <w:r>
-        <w:rPr>
-          <w:b/>
-          <w:sz w:val="28"/>
-        </w:rPr>
-        <w:t>Anexo — Contenido redactado por el estudiante</w:t>
-      </w:r>
-    </w:p>
-    <w:p>
-      <w:r>
-        <w:rPr>
-          <w:b/>
-          <w:sz w:val="24"/>
-        </w:rPr>
-        <w:t>Abstract (English)</w:t>
-      </w:r>
-    </w:p>
-    <w:p>
-      <w:pPr>
-        <w:spacing w:after="200"/>
-      </w:pPr>
-      <w:r>
-        <w:t>FeriaPlace is a web application designed to manage and commercialize stalls in local open-air markets (ferias libres) in Chile. The system addresses a common problem in municipal administration: markets are still managed through manual or scattered records, which makes it difficult to track stall availability, occupancy history, and vendor requests. FeriaPlace centralizes this process by allowing an administrator to organize a market into sectors and stalls, review incoming vendor requests, and assign an available stall while automatically preventing date-overlapping reservations. Vendors can register, submit a request specifying their trade and preferred dates, and track its status online. The project applies five core competencies of the Computer Engineering profile: proposing an IT solution, designing a scalable data model, designing a system architecture, developing software using systematic best practices, and programming database queries.</w:t>
-      </w:r>
-    </w:p>
-    <w:p>
-      <w:r>
-        <w:rPr>
-          <w:b/>
-          <w:sz w:val="24"/>
-        </w:rPr>
-        <w:t>Resumen (Español)</w:t>
-      </w:r>
-    </w:p>
-    <w:p>
-      <w:pPr>
-        <w:spacing w:after="200"/>
-      </w:pPr>
-      <w:r>
-        <w:t>FeriaPlace es una aplicación web orientada a la gestión y comercialización de puestos en ferias libres en Chile. El sistema aborda un problema común en la administración municipal: las ferias todavía se gestionan mediante registros manuales o dispersos, lo que dificulta controlar la disponibilidad de los puestos, el historial de ocupación y las solicitudes de los comerciantes. FeriaPlace centraliza este proceso permitiendo que un administrador organice la feria en sectores y puestos, revise las solicitudes de los comerciantes y asigne un puesto disponible, evitando automáticamente reservas que se crucen en fechas. Los comerciantes pueden registrarse, enviar una solicitud indicando su rubro y fechas preferidas, y revisar su estado en línea. El proyecto aplica cinco competencias del perfil de egreso de Ingeniería en Informática: ofrecer una propuesta de solución informática, construir un modelo de datos escalable, construir un modelo arquitectónico, desarrollar software con técnicas que sistematicen su desarrollo, y programar consultas de base de datos.</w:t>
-      </w:r>
-    </w:p>
-    <w:p>
-      <w:r>
-        <w:rPr>
-          <w:b/>
-          <w:sz w:val="24"/>
-        </w:rPr>
-        <w:t>Conclusions (English)</w:t>
-      </w:r>
-    </w:p>
-    <w:p>
-      <w:pPr>
-        <w:spacing w:after="200"/>
-      </w:pPr>
-      <w:r>
-        <w:t>By the end of Phase 1, the FeriaPlace project has a clearly defined scope, a validated entity-relationship model, and a working prototype that demonstrates the request-and-assignment flow proposed during project definition. Designing the data model around a central Solicitud (request) entity, instead of linking a stall directly to a vendor, proved to be the right decision: it preserves the full occupancy history and makes it straightforward to prevent double bookings through a date-overlap validation query. The next phase will focus on turning the validated backend logic into a fully deployed system and refining the visual map of the market.</w:t>
-      </w:r>
-    </w:p>
-    <w:p>
-      <w:r>
-        <w:rPr>
-          <w:b/>
-          <w:sz w:val="24"/>
-        </w:rPr>
-        <w:t>Reflection (English)</w:t>
-      </w:r>
-    </w:p>
-    <w:p>
-      <w:pPr>
-        <w:spacing w:after="200"/>
-      </w:pPr>
-      <w:r>
-        <w:t>Working on this project helped me realize that database design was my biggest weakness going in, and dedicating the first weeks specifically to validating the entity-relationship model against real use cases, instead of jumping straight into coding, made a real difference in how confident I feel about the rest of the development. I also learned that a project proposal should describe future work in future tense, and that an evidence table needs to be worded carefully so it does not imply that work has already been completed. Managing this project individually pushed me to take full ownership of every technical decision, from the data model to the request-approval workflow.</w:t>
-      </w:r>
     </w:p>
     <w:sectPr>
       <w:headerReference w:type="default" r:id="rId12"/>

</xml_diff>